<commit_message>
refactor: update template report kalibrasi
</commit_message>
<xml_diff>
--- a/templates/template_report_kalibrasi.docx
+++ b/templates/template_report_kalibrasi.docx
@@ -2786,9 +2786,8 @@
                 <w:szCs w:val="24"/>
                 <w:lang w:val="en-US"/>
               </w:rPr>
-              <w:t>showNh3</w:t>
-            </w:r>
-            <w:proofErr w:type="gramStart"/>
+              <w:t>showNh3nRegression</w:t>
+            </w:r>
             <w:r>
               <w:rPr>
                 <w:rFonts w:ascii="Times New Roman" w:eastAsia="Times New Roman" w:hAnsi="Times New Roman" w:cs="Times New Roman"/>
@@ -2796,15 +2795,6 @@
                 <w:szCs w:val="24"/>
                 <w:lang w:val="en-US"/>
               </w:rPr>
-              <w:t>nRegression</w:t>
-            </w:r>
-            <w:r>
-              <w:rPr>
-                <w:rFonts w:ascii="Times New Roman" w:eastAsia="Times New Roman" w:hAnsi="Times New Roman" w:cs="Times New Roman"/>
-                <w:sz w:val="24"/>
-                <w:szCs w:val="24"/>
-                <w:lang w:val="en-US"/>
-              </w:rPr>
               <w:t>}</w:t>
             </w:r>
             <w:r>
@@ -2813,16 +2803,7 @@
                 <w:sz w:val="24"/>
                 <w:szCs w:val="24"/>
               </w:rPr>
-              <w:t>Persamaan</w:t>
-            </w:r>
-            <w:proofErr w:type="gramEnd"/>
-            <w:r>
-              <w:rPr>
-                <w:rFonts w:ascii="Times New Roman" w:eastAsia="Times New Roman" w:hAnsi="Times New Roman" w:cs="Times New Roman"/>
-                <w:sz w:val="24"/>
-                <w:szCs w:val="24"/>
-              </w:rPr>
-              <w:t xml:space="preserve"> kalibrasi</w:t>
+              <w:t>Persamaan kalibrasi</w:t>
             </w:r>
           </w:p>
         </w:tc>
@@ -4448,10 +4429,10 @@
           <v:path o:extrusionok="f" gradientshapeok="t" o:connecttype="rect"/>
           <o:lock v:ext="edit" aspectratio="t"/>
         </v:shapetype>
-        <v:shape id="4098" o:spid="_x0000_i1025" type="#_x0000_t75" style="width:450.5pt;height:7pt;visibility:visible;mso-wrap-distance-left:0;mso-wrap-distance-right:0">
+        <v:shape id="4098" o:spid="_x0000_i1025" type="#_x0000_t75" style="width:450.75pt;height:6.75pt;visibility:visible;mso-wrap-distance-left:0;mso-wrap-distance-right:0">
           <v:imagedata r:id="rId1" o:title="" embosscolor="white"/>
         </v:shape>
-        <o:OLEObject Type="Embed" ProgID="CorelDraw.Graphic.16" ShapeID="4098" DrawAspect="Content" ObjectID="_1843650887" r:id="rId2"/>
+        <o:OLEObject Type="Embed" ProgID="CorelDraw.Graphic.16" ShapeID="4098" DrawAspect="Content" ObjectID="_1853395251" r:id="rId2"/>
       </w:object>
     </w:r>
     <w:r>
@@ -4525,14 +4506,6 @@
     </w:r>
     <w:r>
       <w:rPr>
-        <w:color w:val="000000"/>
-        <w:sz w:val="20"/>
-        <w:szCs w:val="20"/>
-      </w:rPr>
-      <w:t>FACTORY</w:t>
-    </w:r>
-    <w:r>
-      <w:rPr>
         <w:rStyle w:val="apple-tab-span"/>
         <w:color w:val="000000"/>
         <w:sz w:val="20"/>
@@ -4581,14 +4554,6 @@
       </w:rPr>
       <w:tab/>
     </w:r>
-    <w:r>
-      <w:rPr>
-        <w:color w:val="000000"/>
-        <w:sz w:val="20"/>
-        <w:szCs w:val="20"/>
-      </w:rPr>
-      <w:t>Jl. Jakarta No. 24, Bandung 40272</w:t>
-    </w:r>
   </w:p>
   <w:p>
     <w:pPr>
@@ -4601,7 +4566,7 @@
         <w:sz w:val="20"/>
         <w:szCs w:val="20"/>
       </w:rPr>
-      <w:t>HP: 0812-1432-1083</w:t>
+      <w:t>www.getsensync.com</w:t>
     </w:r>
     <w:r>
       <w:rPr>
@@ -4630,34 +4595,6 @@
       </w:rPr>
       <w:tab/>
     </w:r>
-    <w:r>
-      <w:rPr>
-        <w:rStyle w:val="apple-tab-span"/>
-        <w:color w:val="000000"/>
-        <w:sz w:val="20"/>
-        <w:szCs w:val="20"/>
-      </w:rPr>
-      <w:tab/>
-    </w:r>
-    <w:r>
-      <w:rPr>
-        <w:color w:val="000000"/>
-        <w:sz w:val="20"/>
-        <w:szCs w:val="20"/>
-      </w:rPr>
-      <w:t xml:space="preserve">Email: </w:t>
-    </w:r>
-    <w:hyperlink r:id="rId3" w:history="1">
-      <w:r>
-        <w:rPr>
-          <w:rStyle w:val="Hyperlink"/>
-          <w:color w:val="000000"/>
-          <w:sz w:val="20"/>
-          <w:szCs w:val="20"/>
-        </w:rPr>
-        <w:t>info@getsensync.com</w:t>
-      </w:r>
-    </w:hyperlink>
   </w:p>
   <w:p>
     <w:pPr>
@@ -4712,15 +4649,6 @@
         <w:lang w:val="en-US"/>
       </w:rPr>
       <w:t xml:space="preserve"> </w:t>
-    </w:r>
-    <w:r>
-      <w:rPr>
-        <w:rFonts w:ascii="Times New Roman" w:hAnsi="Times New Roman" w:cs="Times New Roman"/>
-        <w:color w:val="000000"/>
-        <w:sz w:val="20"/>
-        <w:szCs w:val="20"/>
-      </w:rPr>
-      <w:t>http://www.getsensync.com</w:t>
     </w:r>
   </w:p>
   <w:p>
@@ -5740,7 +5668,6 @@
     <w:name w:val="Normal (Web)"/>
     <w:basedOn w:val="Normal"/>
     <w:uiPriority w:val="99"/>
-    <w:semiHidden/>
     <w:unhideWhenUsed/>
     <w:rsid w:val="00461A41"/>
     <w:pPr>
@@ -6082,28 +6009,28 @@
 </file>
 
 <file path=customXml/item1.xml><?xml version="1.0" encoding="utf-8"?>
+<b:Sources xmlns:b="http://schemas.openxmlformats.org/officeDocument/2006/bibliography" xmlns="http://schemas.openxmlformats.org/officeDocument/2006/bibliography" SelectedStyle="\APASixthEditionOfficeOnline.xsl" StyleName="APA" Version="6"/>
+</file>
+
+<file path=customXml/item2.xml><?xml version="1.0" encoding="utf-8"?>
 <go:gDocsCustomXmlDataStorage xmlns:go="http://customooxmlschemas.google.com/" xmlns:r="http://schemas.openxmlformats.org/officeDocument/2006/relationships" uri="GoogleDocsCustomDataVersion2">
   <go:docsCustomData xmlns:go="http://customooxmlschemas.google.com/" roundtripDataSignature="AMtx7mizTzFiuqvVN7xXvErdr3LxufNAwQ==">CgMxLjAyCWlkLmdqZGd4czgAciExZjZSRGM2SGNwQV8tYy12eUVxeDc1VXFFZDZLUkIwNHc=</go:docsCustomData>
 </go:gDocsCustomXmlDataStorage>
 </file>
 
-<file path=customXml/item2.xml><?xml version="1.0" encoding="utf-8"?>
-<b:Sources xmlns:b="http://schemas.openxmlformats.org/officeDocument/2006/bibliography" xmlns="http://schemas.openxmlformats.org/officeDocument/2006/bibliography" SelectedStyle="\APASixthEditionOfficeOnline.xsl" StyleName="APA" Version="6"/>
+<file path=customXml/itemProps1.xml><?xml version="1.0" encoding="utf-8"?>
+<ds:datastoreItem xmlns:ds="http://schemas.openxmlformats.org/officeDocument/2006/customXml" ds:itemID="{3B667AE9-1455-4274-8204-A98B5D8E8026}">
+  <ds:schemaRefs>
+    <ds:schemaRef ds:uri="http://schemas.openxmlformats.org/officeDocument/2006/bibliography"/>
+  </ds:schemaRefs>
+</ds:datastoreItem>
 </file>
 
-<file path=customXml/itemProps1.xml><?xml version="1.0" encoding="utf-8"?>
+<file path=customXml/itemProps2.xml><?xml version="1.0" encoding="utf-8"?>
 <ds:datastoreItem xmlns:ds="http://schemas.openxmlformats.org/officeDocument/2006/customXml" ds:itemID="{11111111-1234-1234-1234-123412341234}">
   <ds:schemaRefs>
     <ds:schemaRef ds:uri="http://customooxmlschemas.google.com/"/>
     <ds:schemaRef ds:uri="http://schemas.openxmlformats.org/officeDocument/2006/relationships"/>
   </ds:schemaRefs>
 </ds:datastoreItem>
-</file>
-
-<file path=customXml/itemProps2.xml><?xml version="1.0" encoding="utf-8"?>
-<ds:datastoreItem xmlns:ds="http://schemas.openxmlformats.org/officeDocument/2006/customXml" ds:itemID="{3B667AE9-1455-4274-8204-A98B5D8E8026}">
-  <ds:schemaRefs>
-    <ds:schemaRef ds:uri="http://schemas.openxmlformats.org/officeDocument/2006/bibliography"/>
-  </ds:schemaRefs>
-</ds:datastoreItem>
 </file>
</xml_diff>